<commit_message>
Correct native list resets and retain PowerPoint table markers
</commit_message>
<xml_diff>
--- a/OfficeIMO.TestAssets/Documents/IWorkCorpus/native-exports/pages-list-continuation-officeimo-v15.4.docx
+++ b/OfficeIMO.TestAssets/Documents/IWorkCorpus/native-exports/pages-list-continuation-officeimo-v15.4.docx
@@ -243,7 +243,7 @@
       <w:pPr>
         <w:numPr>
           <w:ilvl w:val="0"/>
-          <w:numId w:val="2"/>
+          <w:numId w:val="3"/>
         </w:numPr>
         <w:spacing w:before="0" w:after="160" w:line="259" w:lineRule="auto"/>
         <w:ind w:left="330" w:right="0" w:hanging="330"/>
@@ -278,7 +278,7 @@
       <w:pPr>
         <w:numPr>
           <w:ilvl w:val="1"/>
-          <w:numId w:val="2"/>
+          <w:numId w:val="3"/>
         </w:numPr>
         <w:spacing w:before="0" w:after="160" w:line="259" w:lineRule="auto"/>
         <w:ind w:left="690" w:right="0" w:hanging="330"/>
@@ -313,7 +313,7 @@
       <w:pPr>
         <w:numPr>
           <w:ilvl w:val="1"/>
-          <w:numId w:val="3"/>
+          <w:numId w:val="4"/>
         </w:numPr>
         <w:spacing w:before="0" w:after="160" w:line="259" w:lineRule="auto"/>
         <w:ind w:left="690" w:right="0" w:hanging="330"/>
@@ -348,7 +348,7 @@
       <w:pPr>
         <w:numPr>
           <w:ilvl w:val="1"/>
-          <w:numId w:val="3"/>
+          <w:numId w:val="4"/>
         </w:numPr>
         <w:spacing w:before="0" w:after="160" w:line="259" w:lineRule="auto"/>
         <w:ind w:left="690" w:right="0" w:hanging="330"/>
@@ -414,7 +414,7 @@
       <w:pPr>
         <w:numPr>
           <w:ilvl w:val="1"/>
-          <w:numId w:val="4"/>
+          <w:numId w:val="5"/>
         </w:numPr>
         <w:spacing w:before="0" w:after="160" w:line="259" w:lineRule="auto"/>
         <w:ind w:left="690" w:right="0" w:hanging="330"/>
@@ -449,7 +449,7 @@
       <w:pPr>
         <w:numPr>
           <w:ilvl w:val="0"/>
-          <w:numId w:val="5"/>
+          <w:numId w:val="6"/>
         </w:numPr>
         <w:spacing w:before="0" w:after="160" w:line="259" w:lineRule="auto"/>
         <w:ind w:left="330" w:right="0" w:hanging="330"/>
@@ -484,7 +484,7 @@
       <w:pPr>
         <w:numPr>
           <w:ilvl w:val="0"/>
-          <w:numId w:val="6"/>
+          <w:numId w:val="7"/>
         </w:numPr>
         <w:spacing w:before="0" w:after="160" w:line="259" w:lineRule="auto"/>
         <w:ind w:left="330" w:right="0" w:hanging="330"/>
@@ -519,7 +519,7 @@
       <w:pPr>
         <w:numPr>
           <w:ilvl w:val="0"/>
-          <w:numId w:val="6"/>
+          <w:numId w:val="7"/>
         </w:numPr>
         <w:spacing w:before="0" w:after="160" w:line="259" w:lineRule="auto"/>
         <w:ind w:left="330" w:right="0" w:hanging="330"/>
@@ -551,8 +551,8 @@
       </w:r>
     </w:p>
     <w:sectPr>
-      <w:headerReference w:type="default" r:id="Re6e7afb4e4c9497e"/>
-      <w:footerReference w:type="default" r:id="R3935d7b470d143e0"/>
+      <w:headerReference w:type="default" r:id="Ra10b536b4ddc4d7d"/>
+      <w:footerReference w:type="default" r:id="R589201a06bf14f8b"/>
       <w:pgSz w:w="12240" w:h="15840" w:orient="portrait" w:code="1"/>
       <w:pgMar w:top="1440" w:right="1440" w:bottom="1440" w:left="1440" w:header="720" w:footer="720" w:gutter="0"/>
     </w:sectPr>
@@ -600,9 +600,9 @@
 <file path=word/numbering.xml><?xml version="1.0" encoding="utf-8"?>
 <w:numbering xmlns:wpc="http://schemas.microsoft.com/office/word/2010/wordprocessingCanvas" xmlns:cx="http://schemas.microsoft.com/office/drawing/2014/chartex" xmlns:cx1="http://schemas.microsoft.com/office/drawing/2015/9/8/chartex" xmlns:cx2="http://schemas.microsoft.com/office/drawing/2015/10/21/chartex" xmlns:cx3="http://schemas.microsoft.com/office/drawing/2016/5/9/chartex" xmlns:cx4="http://schemas.microsoft.com/office/drawing/2016/5/10/chartex" xmlns:cx5="http://schemas.microsoft.com/office/drawing/2016/5/11/chartex" xmlns:cx6="http://schemas.microsoft.com/office/drawing/2016/5/12/chartex" xmlns:cx7="http://schemas.microsoft.com/office/drawing/2016/5/13/chartex" xmlns:cx8="http://schemas.microsoft.com/office/drawing/2016/5/14/chartex" xmlns:mc="http://schemas.openxmlformats.org/markup-compatibility/2006" xmlns:aink="http://schemas.microsoft.com/office/drawing/2016/ink" xmlns:am3d="http://schemas.microsoft.com/office/drawing/2017/model3d" xmlns:o="urn:schemas-microsoft-com:office:office" xmlns:oel="http://schemas.microsoft.com/office/2019/extlst" xmlns:r="http://schemas.openxmlformats.org/officeDocument/2006/relationships" xmlns:m="http://schemas.openxmlformats.org/officeDocument/2006/math" xmlns:v="urn:schemas-microsoft-com:vml" xmlns:wp14="http://schemas.microsoft.com/office/word/2010/wordprocessingDrawing" xmlns:wp="http://schemas.openxmlformats.org/drawingml/2006/wordprocessingDrawing" xmlns:w10="urn:schemas-microsoft-com:office:word" xmlns:w="http://schemas.openxmlformats.org/wordprocessingml/2006/main" xmlns:w14="http://schemas.microsoft.com/office/word/2010/wordml" xmlns:w15="http://schemas.microsoft.com/office/word/2012/wordml" xmlns:w16cex="http://schemas.microsoft.com/office/word/2018/wordml/cex" xmlns:w16cid="http://schemas.microsoft.com/office/word/2016/wordml/cid" xmlns:w16="http://schemas.microsoft.com/office/word/2018/wordml" xmlns:w16sdtdh="http://schemas.microsoft.com/office/word/2020/wordml/sdtdatahash" xmlns:w16se="http://schemas.microsoft.com/office/word/2015/wordml/symex" xmlns:wpg="http://schemas.microsoft.com/office/word/2010/wordprocessingGroup" xmlns:wpi="http://schemas.microsoft.com/office/word/2010/wordprocessingInk" xmlns:wne="http://schemas.microsoft.com/office/word/2006/wordml" xmlns:wps="http://schemas.microsoft.com/office/word/2010/wordprocessingShape" mc:Ignorable="w14 w15 w16se w16cid w16 w16cex w16sdtdh wp14">
   <w:abstractNum w:abstractNumId="0" w15:restartNumberingAfterBreak="0">
-    <w:nsid w:val="E78D00C2"/>
+    <w:nsid w:val="8B7520BF"/>
     <w:multiLevelType w:val="hybridMultilevel"/>
-    <w:tmpl w:val="00DE8D7E"/>
+    <w:tmpl w:val="2712487F"/>
     <w:lvl w:ilvl="0">
       <w:start w:val="7"/>
       <w:numFmt w:val="decimal"/>
@@ -620,9 +620,9 @@
     </w:lvl>
   </w:abstractNum>
   <w:abstractNum w:abstractNumId="1" w15:restartNumberingAfterBreak="0">
-    <w:nsid w:val="039162E2"/>
+    <w:nsid w:val="7F2C01C1"/>
     <w:multiLevelType w:val="hybridMultilevel"/>
-    <w:tmpl w:val="E9F6C6E8"/>
+    <w:tmpl w:val="75D306DD"/>
     <w:lvl w:ilvl="0">
       <w:start w:val="9"/>
       <w:numFmt w:val="decimal"/>
@@ -655,9 +655,44 @@
     </w:lvl>
   </w:abstractNum>
   <w:abstractNum w:abstractNumId="2" w15:restartNumberingAfterBreak="0">
-    <w:nsid w:val="DBEB2159"/>
+    <w:nsid w:val="71335E87"/>
     <w:multiLevelType w:val="hybridMultilevel"/>
-    <w:tmpl w:val="4B6880FB"/>
+    <w:tmpl w:val="16E44D87"/>
+    <w:lvl w:ilvl="0">
+      <w:start w:val="10"/>
+      <w:numFmt w:val="decimal"/>
+      <w:suff w:val="tab"/>
+      <w:lvlText w:val="%1."/>
+      <w:lvlJc w:val="left"/>
+      <w:pPr>
+        <w:ind w:left="330" w:hanging="330"/>
+      </w:pPr>
+      <w:rPr>
+        <w:rFonts w:ascii="Calibri" w:hAnsi="Calibri"/>
+        <w:sz w:val="22"/>
+        <w:szCs w:val="22"/>
+      </w:rPr>
+    </w:lvl>
+    <w:lvl w:ilvl="1">
+      <w:start w:val="1"/>
+      <w:numFmt w:val="decimal"/>
+      <w:suff w:val="tab"/>
+      <w:lvlText w:val="%2."/>
+      <w:lvlJc w:val="left"/>
+      <w:pPr>
+        <w:ind w:left="690" w:hanging="330"/>
+      </w:pPr>
+      <w:rPr>
+        <w:rFonts w:ascii="Calibri" w:hAnsi="Calibri"/>
+        <w:sz w:val="22"/>
+        <w:szCs w:val="22"/>
+      </w:rPr>
+    </w:lvl>
+  </w:abstractNum>
+  <w:abstractNum w:abstractNumId="3" w15:restartNumberingAfterBreak="0">
+    <w:nsid w:val="4DD179BC"/>
+    <w:multiLevelType w:val="hybridMultilevel"/>
+    <w:tmpl w:val="F69D5867"/>
     <w:lvl w:ilvl="0">
       <w:start w:val="1"/>
       <w:numFmt w:val="decimal"/>
@@ -673,7 +708,7 @@
       </w:rPr>
     </w:lvl>
     <w:lvl w:ilvl="1">
-      <w:start w:val="5"/>
+      <w:start w:val="1"/>
       <w:numFmt w:val="decimal"/>
       <w:suff w:val="tab"/>
       <w:lvlText w:val="%2."/>
@@ -688,10 +723,10 @@
       </w:rPr>
     </w:lvl>
   </w:abstractNum>
-  <w:abstractNum w:abstractNumId="3" w15:restartNumberingAfterBreak="0">
-    <w:nsid w:val="4D540352"/>
+  <w:abstractNum w:abstractNumId="4" w15:restartNumberingAfterBreak="0">
+    <w:nsid w:val="781EB981"/>
     <w:multiLevelType w:val="hybridMultilevel"/>
-    <w:tmpl w:val="86F5714C"/>
+    <w:tmpl w:val="EA623E44"/>
     <w:lvl w:ilvl="0">
       <w:start w:val="1"/>
       <w:numFmt w:val="decimal"/>
@@ -707,7 +742,7 @@
       </w:rPr>
     </w:lvl>
     <w:lvl w:ilvl="1">
-      <w:start w:val="7"/>
+      <w:start w:val="1"/>
       <w:numFmt w:val="decimal"/>
       <w:suff w:val="tab"/>
       <w:lvlText w:val="%2."/>
@@ -722,10 +757,10 @@
       </w:rPr>
     </w:lvl>
   </w:abstractNum>
-  <w:abstractNum w:abstractNumId="4" w15:restartNumberingAfterBreak="0">
-    <w:nsid w:val="8A52341B"/>
+  <w:abstractNum w:abstractNumId="5" w15:restartNumberingAfterBreak="0">
+    <w:nsid w:val="FF5B812D"/>
     <w:multiLevelType w:val="hybridMultilevel"/>
-    <w:tmpl w:val="47662360"/>
+    <w:tmpl w:val="6CC17148"/>
     <w:lvl w:ilvl="0">
       <w:start w:val="11"/>
       <w:numFmt w:val="decimal"/>
@@ -742,10 +777,10 @@
       </w:rPr>
     </w:lvl>
   </w:abstractNum>
-  <w:abstractNum w:abstractNumId="5" w15:restartNumberingAfterBreak="0">
-    <w:nsid w:val="DCCD9221"/>
+  <w:abstractNum w:abstractNumId="6" w15:restartNumberingAfterBreak="0">
+    <w:nsid w:val="F0FAA79D"/>
     <w:multiLevelType w:val="hybridMultilevel"/>
-    <w:tmpl w:val="9729EE26"/>
+    <w:tmpl w:val="A9992C33"/>
     <w:lvl w:ilvl="0">
       <w:start w:val="3"/>
       <w:numFmt w:val="decimal"/>
@@ -764,21 +799,51 @@
   </w:abstractNum>
   <w:num w:numId="1">
     <w:abstractNumId w:val="0"/>
+    <w:lvlOverride w:ilvl="0">
+      <w:startOverride w:val="7"/>
+    </w:lvlOverride>
   </w:num>
   <w:num w:numId="2">
     <w:abstractNumId w:val="1"/>
+    <w:lvlOverride w:ilvl="0">
+      <w:startOverride w:val="9"/>
+    </w:lvlOverride>
+    <w:lvlOverride w:ilvl="1">
+      <w:startOverride w:val="1"/>
+    </w:lvlOverride>
   </w:num>
   <w:num w:numId="3">
     <w:abstractNumId w:val="2"/>
+    <w:lvlOverride w:ilvl="0">
+      <w:startOverride w:val="10"/>
+    </w:lvlOverride>
+    <w:lvlOverride w:ilvl="1">
+      <w:startOverride w:val="1"/>
+    </w:lvlOverride>
   </w:num>
   <w:num w:numId="4">
     <w:abstractNumId w:val="3"/>
+    <w:lvlOverride w:ilvl="1">
+      <w:startOverride w:val="5"/>
+    </w:lvlOverride>
   </w:num>
   <w:num w:numId="5">
     <w:abstractNumId w:val="4"/>
+    <w:lvlOverride w:ilvl="1">
+      <w:startOverride w:val="7"/>
+    </w:lvlOverride>
   </w:num>
   <w:num w:numId="6">
     <w:abstractNumId w:val="5"/>
+    <w:lvlOverride w:ilvl="0">
+      <w:startOverride w:val="11"/>
+    </w:lvlOverride>
+  </w:num>
+  <w:num w:numId="7">
+    <w:abstractNumId w:val="6"/>
+    <w:lvlOverride w:ilvl="0">
+      <w:startOverride w:val="3"/>
+    </w:lvlOverride>
   </w:num>
 </w:numbering>
 </file>

</xml_diff>